<commit_message>
Add living-document link, per-document PDFs and complete compendium
- pdf/: business plan, deck, mind map, PM plan, tracker and meeting record
  as PDFs; 07_Complete_Compendium.pdf joins them all with bookmarks
- meeting/: summary and full transcript as received
- Content: smaller meeting details added so every output captures them;
  version 1.2 (21 Oct 2026); roadmap 'today' line driven by AS_OF
- Mind map embeds diagram PNGs so flowcharts render offline and in print
- Tracker gets A4 landscape print setup

Co-Authored-By: Claude Opus 5.5 <noreply@anthropic.com>
Claude-Session: https://claude.ai/code/session_01PuDfHj7dThQJ8wSqjxQQJi
</commit_message>
<xml_diff>
--- a/business-plans/prasadam-vertical/01_Business_Plan.docx
+++ b/business-plans/prasadam-vertical/01_Business_Plan.docx
@@ -91,7 +91,7 @@
           <w:color w:val="555555"/>
           <w:sz w:val="22"/>
         </w:rPr>
-        <w:t>v1.0 draft, 26 September 2026</w:t>
+        <w:t>v1.2, 21 October 2026</w:t>
       </w:r>
     </w:p>
     <w:p/>
@@ -1033,7 +1033,7 @@
         <w:pStyle w:val="ListBullet"/>
       </w:pPr>
       <w:r>
-        <w:t>Mahalaya (Pitru Paksha) brings many people for service; last year ~200 lakh-level participation was mentioned. Put sweets and savories stalls there too.</w:t>
+        <w:t>Mahalaya (Pitru Paksha) brings many people for service; a figure of about 200 lakh was mentioned for last year (the transcript is unclear on what it measured). Put sweets and savories stalls there too.</w:t>
       </w:r>
     </w:p>
     <w:p>
@@ -1418,6 +1418,102 @@
       </w:pPr>
       <w:r>
         <w:t>Other related ideas raised: dairy products and ghee; temple advertising projects; education company in 150 languages; Krishna-conscious games; audio/video in 50 languages (outside this plan's scope but share the same DMTT capability).</w:t>
+      </w:r>
+    </w:p>
+    <w:p>
+      <w:pPr>
+        <w:pStyle w:val="Heading2"/>
+      </w:pPr>
+      <w:r>
+        <w:t>Smaller details also mentioned</w:t>
+      </w:r>
+    </w:p>
+    <w:p>
+      <w:pPr>
+        <w:pStyle w:val="ListBullet"/>
+      </w:pPr>
+      <w:r>
+        <w:t>About 10 days was mentioned for samples and feasibility on internal-department pricing.</w:t>
+      </w:r>
+    </w:p>
+    <w:p>
+      <w:pPr>
+        <w:pStyle w:val="ListBullet"/>
+      </w:pPr>
+      <w:r>
+        <w:t>"In 65 days we can do it" was said about getting the vertical moving before the hero campaigns.</w:t>
+      </w:r>
+    </w:p>
+    <w:p>
+      <w:pPr>
+        <w:pStyle w:val="ListBullet"/>
+      </w:pPr>
+      <w:r>
+        <w:t>Hero campaigns named: Dasara, Ganesh Chaturthi, New Year, Pitru Paksha, Acharya month and other temple festivals.</w:t>
+      </w:r>
+    </w:p>
+    <w:p>
+      <w:pPr>
+        <w:pStyle w:val="ListBullet"/>
+      </w:pPr>
+      <w:r>
+        <w:t>Vasudha is not a competitor; it works on a different platform. Few other temple groups produce sweets and savories at scale.</w:t>
+      </w:r>
+    </w:p>
+    <w:p>
+      <w:pPr>
+        <w:pStyle w:val="ListBullet"/>
+      </w:pPr>
+      <w:r>
+        <w:t>Mukunda Dasa recently visited a well-known business that now sells a full range of laddus and products, and brought back samples.</w:t>
+      </w:r>
+    </w:p>
+    <w:p>
+      <w:pPr>
+        <w:pStyle w:val="ListBullet"/>
+      </w:pPr>
+      <w:r>
+        <w:t>A visitor with long-running business in Europe offered a connection.</w:t>
+      </w:r>
+    </w:p>
+    <w:p>
+      <w:pPr>
+        <w:pStyle w:val="ListBullet"/>
+      </w:pPr>
+      <w:r>
+        <w:t>Companies already pay some vendor for festival gifts; middlemen in purchase departments may take commission, but owners prefer a source they trust.</w:t>
+      </w:r>
+    </w:p>
+    <w:p>
+      <w:pPr>
+        <w:pStyle w:val="ListBullet"/>
+      </w:pPr>
+      <w:r>
+        <w:t>Gift boxes can carry the client's branding with a sticker; earlier requests were refused because no facility existed.</w:t>
+      </w:r>
+    </w:p>
+    <w:p>
+      <w:pPr>
+        <w:pStyle w:val="ListBullet"/>
+      </w:pPr>
+      <w:r>
+        <w:t>Chinmaya Mission's 50,000-meal enquiry was passed to a professor contact; it should not be lost.</w:t>
+      </w:r>
+    </w:p>
+    <w:p>
+      <w:pPr>
+        <w:pStyle w:val="ListBullet"/>
+      </w:pPr>
+      <w:r>
+        <w:t>Google has given the organisation ₹75 lakh in funding for technology products (context for DMTT's capacity).</w:t>
+      </w:r>
+    </w:p>
+    <w:p>
+      <w:pPr>
+        <w:pStyle w:val="ListBullet"/>
+      </w:pPr>
+      <w:r>
+        <w:t>Some passages of the transcript are garbled (names, a few numbers); points are recorded as heard.</w:t>
       </w:r>
     </w:p>
     <w:p>

</xml_diff>